<commit_message>
blocks(household): tai dung luoi ds_nganh 4 cot PLII_M02/PLII_M07 qua pipeline --one
</commit_message>
<xml_diff>
--- a/app/templates/PLII_M02.docx
+++ b/app/templates/PLII_M02.docx
@@ -2706,104 +2706,227 @@
         <w:t xml:space="preserve"> </w:t>
       </w:r>
     </w:p>
-    <w:p>
-      <w:pPr>
-        <w:jc w:val="center"/>
-        <w:spacing w:before="120"/>
-      </w:pPr>
-      <w:r>
-        <w:rPr>
-          <w:rFonts w:ascii="Arial" w:hAnsi="Arial" w:cs="Arial"/>
-          <w:sz w:val="24"/>
-          <w:sz-cs w:val="24"/>
-          <w:b/>
-        </w:rPr>
-        <w:t xml:space="preserve">STT</w:t>
-      </w:r>
-    </w:p>
-    <w:p>
-      <w:pPr>
-        <w:jc w:val="center"/>
-        <w:spacing w:before="120"/>
-      </w:pPr>
-      <w:r>
-        <w:rPr>
-          <w:rFonts w:ascii="Arial" w:hAnsi="Arial" w:cs="Arial"/>
-          <w:sz w:val="24"/>
-          <w:sz-cs w:val="24"/>
-          <w:b/>
-        </w:rPr>
-        <w:t xml:space="preserve">Tên ngành</w:t>
-      </w:r>
-    </w:p>
-    <w:p>
-      <w:pPr>
-        <w:jc w:val="center"/>
-        <w:spacing w:before="120"/>
-      </w:pPr>
-      <w:r>
-        <w:rPr>
-          <w:rFonts w:ascii="Arial" w:hAnsi="Arial" w:cs="Arial"/>
-          <w:sz w:val="24"/>
-          <w:sz-cs w:val="24"/>
-          <w:b/>
-        </w:rPr>
-        <w:t xml:space="preserve">Mã ngành</w:t>
-      </w:r>
-      <w:r>
-        <w:rPr>
-          <w:rFonts w:ascii="Arial" w:hAnsi="Arial" w:cs="Arial"/>
-          <w:sz w:val="24"/>
-          <w:sz-cs w:val="24"/>
-          <w:b/>
-          <w:vertAlign w:val="superscript"/>
-        </w:rPr>
-        <w:t xml:space="preserve">8</w:t>
-      </w:r>
-      <w:r>
-        <w:rPr>
-          <w:rFonts w:ascii="Arial" w:hAnsi="Arial" w:cs="Arial"/>
-          <w:sz w:val="24"/>
-          <w:sz-cs w:val="24"/>
-          <w:b/>
-        </w:rPr>
-        <w:t xml:space="preserve"/>
-      </w:r>
-    </w:p>
-    <w:p>
-      <w:pPr>
-        <w:jc w:val="center"/>
-        <w:spacing w:before="120"/>
-      </w:pPr>
-      <w:r>
-        <w:rPr>
-          <w:rFonts w:ascii="Arial" w:hAnsi="Arial" w:cs="Arial"/>
-          <w:sz w:val="24"/>
-          <w:sz-cs w:val="24"/>
-          <w:b/>
-        </w:rPr>
-        <w:t xml:space="preserve">Ngành, nghề kinh doanh chính</w:t>
-      </w:r>
-      <w:r>
-        <w:rPr>
-          <w:rFonts w:ascii="Arial" w:hAnsi="Arial" w:cs="Arial"/>
-          <w:sz w:val="24"/>
-          <w:sz-cs w:val="24"/>
-          <w:b/>
-          <w:vertAlign w:val="superscript"/>
-        </w:rPr>
-        <w:t xml:space="preserve">9</w:t>
-      </w:r>
-      <w:r>
-        <w:rPr>
-          <w:rFonts w:ascii="Arial" w:hAnsi="Arial" w:cs="Arial"/>
-          <w:sz w:val="24"/>
-          <w:sz-cs w:val="24"/>
-          <w:b/>
-        </w:rPr>
-        <w:t xml:space="preserve"/>
-      </w:r>
-    </w:p>
+    <w:tbl>
+      <w:tblPr>
+        <w:tblW w:type="auto" w:w="0"/>
+        <w:tblLook w:firstColumn="1" w:firstRow="1" w:lastColumn="0" w:lastRow="0" w:noHBand="0" w:noVBand="1" w:val="04A0"/>
+        <w:tblBorders>
+          <w:top w:val="single" w:sz="4" w:color="000000"/>
+          <w:left w:val="single" w:sz="4" w:color="000000"/>
+          <w:bottom w:val="single" w:sz="4" w:color="000000"/>
+          <w:right w:val="single" w:sz="4" w:color="000000"/>
+          <w:insideH w:val="single" w:sz="4" w:color="000000"/>
+          <w:insideV w:val="single" w:sz="4" w:color="000000"/>
+        </w:tblBorders>
+      </w:tblPr>
+      <w:tblGrid>
+        <w:gridCol w:w="2160"/>
+        <w:gridCol w:w="2160"/>
+        <w:gridCol w:w="2160"/>
+        <w:gridCol w:w="2160"/>
+      </w:tblGrid>
+      <w:tr>
+        <w:tc>
+          <w:tcPr>
+            <w:tcW w:type="dxa" w:w="2160"/>
+          </w:tcPr>
+          <w:p>
+            <w:r>
+              <w:rPr>
+                <w:b/>
+              </w:rPr>
+              <w:t>STT</w:t>
+            </w:r>
+          </w:p>
+        </w:tc>
+        <w:tc>
+          <w:tcPr>
+            <w:tcW w:type="dxa" w:w="2160"/>
+          </w:tcPr>
+          <w:p>
+            <w:r>
+              <w:rPr>
+                <w:b/>
+              </w:rPr>
+              <w:t>Tên ngành</w:t>
+            </w:r>
+          </w:p>
+        </w:tc>
+        <w:tc>
+          <w:tcPr>
+            <w:tcW w:type="dxa" w:w="2160"/>
+          </w:tcPr>
+          <w:p>
+            <w:r>
+              <w:rPr>
+                <w:b/>
+              </w:rPr>
+              <w:t>Mã ngành</w:t>
+            </w:r>
+          </w:p>
+        </w:tc>
+        <w:tc>
+          <w:tcPr>
+            <w:tcW w:type="dxa" w:w="2160"/>
+          </w:tcPr>
+          <w:p>
+            <w:r>
+              <w:rPr>
+                <w:b/>
+              </w:rPr>
+              <w:t>Ngành, nghề kinh doanh chính</w:t>
+            </w:r>
+          </w:p>
+        </w:tc>
+      </w:tr>
+      <w:tr>
+        <w:tc>
+          <w:tcPr>
+            <w:tcW w:type="dxa" w:w="2160"/>
+          </w:tcPr>
+          <w:p/>
+        </w:tc>
+        <w:tc>
+          <w:tcPr>
+            <w:tcW w:type="dxa" w:w="2160"/>
+          </w:tcPr>
+          <w:p/>
+        </w:tc>
+        <w:tc>
+          <w:tcPr>
+            <w:tcW w:type="dxa" w:w="2160"/>
+          </w:tcPr>
+          <w:p/>
+        </w:tc>
+        <w:tc>
+          <w:tcPr>
+            <w:tcW w:type="dxa" w:w="2160"/>
+          </w:tcPr>
+          <w:p/>
+        </w:tc>
+      </w:tr>
+      <w:tr>
+        <w:tc>
+          <w:tcPr>
+            <w:tcW w:type="dxa" w:w="2160"/>
+          </w:tcPr>
+          <w:p/>
+        </w:tc>
+        <w:tc>
+          <w:tcPr>
+            <w:tcW w:type="dxa" w:w="2160"/>
+          </w:tcPr>
+          <w:p/>
+        </w:tc>
+        <w:tc>
+          <w:tcPr>
+            <w:tcW w:type="dxa" w:w="2160"/>
+          </w:tcPr>
+          <w:p/>
+        </w:tc>
+        <w:tc>
+          <w:tcPr>
+            <w:tcW w:type="dxa" w:w="2160"/>
+          </w:tcPr>
+          <w:p/>
+        </w:tc>
+      </w:tr>
+      <w:tr>
+        <w:tc>
+          <w:tcPr>
+            <w:tcW w:type="dxa" w:w="2160"/>
+          </w:tcPr>
+          <w:p/>
+        </w:tc>
+        <w:tc>
+          <w:tcPr>
+            <w:tcW w:type="dxa" w:w="2160"/>
+          </w:tcPr>
+          <w:p/>
+        </w:tc>
+        <w:tc>
+          <w:tcPr>
+            <w:tcW w:type="dxa" w:w="2160"/>
+          </w:tcPr>
+          <w:p/>
+        </w:tc>
+        <w:tc>
+          <w:tcPr>
+            <w:tcW w:type="dxa" w:w="2160"/>
+          </w:tcPr>
+          <w:p/>
+        </w:tc>
+      </w:tr>
+      <w:tr>
+        <w:tc>
+          <w:tcPr>
+            <w:tcW w:type="dxa" w:w="2160"/>
+          </w:tcPr>
+          <w:p/>
+        </w:tc>
+        <w:tc>
+          <w:tcPr>
+            <w:tcW w:type="dxa" w:w="2160"/>
+          </w:tcPr>
+          <w:p/>
+        </w:tc>
+        <w:tc>
+          <w:tcPr>
+            <w:tcW w:type="dxa" w:w="2160"/>
+          </w:tcPr>
+          <w:p/>
+        </w:tc>
+        <w:tc>
+          <w:tcPr>
+            <w:tcW w:type="dxa" w:w="2160"/>
+          </w:tcPr>
+          <w:p/>
+        </w:tc>
+      </w:tr>
+      <w:tr>
+        <w:tc>
+          <w:tcPr>
+            <w:tcW w:type="dxa" w:w="2160"/>
+          </w:tcPr>
+          <w:p>
+            <w:r>
+              <w:t>{#ds_nganh}{_stt}</w:t>
+            </w:r>
+          </w:p>
+        </w:tc>
+        <w:tc>
+          <w:tcPr>
+            <w:tcW w:type="dxa" w:w="2160"/>
+          </w:tcPr>
+          <w:p>
+            <w:r>
+              <w:t>{ten_nganh}</w:t>
+            </w:r>
+          </w:p>
+        </w:tc>
+        <w:tc>
+          <w:tcPr>
+            <w:tcW w:type="dxa" w:w="2160"/>
+          </w:tcPr>
+          <w:p>
+            <w:r>
+              <w:t>{ma_nganh}</w:t>
+            </w:r>
+          </w:p>
+        </w:tc>
+        <w:tc>
+          <w:tcPr>
+            <w:tcW w:type="dxa" w:w="2160"/>
+          </w:tcPr>
+          <w:p>
+            <w:r>
+              <w:t>{la_nganh_chinh}{/ds_nganh}</w:t>
+            </w:r>
+          </w:p>
+        </w:tc>
+      </w:tr>
+    </w:tbl>
+    <w:p/>
     <w:p>
       <w:pPr>
         <w:jc w:val="center"/>
@@ -3768,6 +3891,192 @@
     </w:sectPr>
   </w:body>
 </w:document>
+</file>
+
+<file path=word/styles.xml><?xml version="1.0" encoding="utf-8"?>
+<w:styles xmlns:mc="http://schemas.openxmlformats.org/markup-compatibility/2006" xmlns:r="http://schemas.openxmlformats.org/officeDocument/2006/relationships" xmlns:w14="http://schemas.microsoft.com/office/word/2010/wordml" xmlns:w="http://schemas.openxmlformats.org/wordprocessingml/2006/main" mc:Ignorable="w14">
+  <w:docDefaults>
+    <w:rPrDefault>
+      <w:rPr>
+        <w:rFonts w:asciiTheme="minorHAnsi" w:eastAsiaTheme="minorEastAsia" w:hAnsiTheme="minorHAnsi" w:cstheme="minorBidi"/>
+        <w:sz w:val="24"/>
+        <w:szCs w:val="24"/>
+        <w:lang w:val="en-US" w:eastAsia="en-US" w:bidi="ar-SA"/>
+      </w:rPr>
+    </w:rPrDefault>
+    <w:pPrDefault/>
+  </w:docDefaults>
+  <w:latentStyles w:defLockedState="0" w:defUIPriority="99" w:defSemiHidden="1" w:defUnhideWhenUsed="1" w:defQFormat="0" w:count="276">
+    <w:lsdException w:name="Normal" w:semiHidden="0" w:uiPriority="0" w:unhideWhenUsed="0" w:qFormat="1"/>
+    <w:lsdException w:name="heading 1" w:semiHidden="0" w:uiPriority="9" w:unhideWhenUsed="0" w:qFormat="1"/>
+    <w:lsdException w:name="heading 2" w:uiPriority="9" w:qFormat="1"/>
+    <w:lsdException w:name="heading 3" w:uiPriority="9" w:qFormat="1"/>
+    <w:lsdException w:name="heading 4" w:uiPriority="9" w:qFormat="1"/>
+    <w:lsdException w:name="heading 5" w:uiPriority="9" w:qFormat="1"/>
+    <w:lsdException w:name="heading 6" w:uiPriority="9" w:qFormat="1"/>
+    <w:lsdException w:name="heading 7" w:uiPriority="9" w:qFormat="1"/>
+    <w:lsdException w:name="heading 8" w:uiPriority="9" w:qFormat="1"/>
+    <w:lsdException w:name="heading 9" w:uiPriority="9" w:qFormat="1"/>
+    <w:lsdException w:name="toc 1" w:uiPriority="39"/>
+    <w:lsdException w:name="toc 2" w:uiPriority="39"/>
+    <w:lsdException w:name="toc 3" w:uiPriority="39"/>
+    <w:lsdException w:name="toc 4" w:uiPriority="39"/>
+    <w:lsdException w:name="toc 5" w:uiPriority="39"/>
+    <w:lsdException w:name="toc 6" w:uiPriority="39"/>
+    <w:lsdException w:name="toc 7" w:uiPriority="39"/>
+    <w:lsdException w:name="toc 8" w:uiPriority="39"/>
+    <w:lsdException w:name="toc 9" w:uiPriority="39"/>
+    <w:lsdException w:name="caption" w:uiPriority="35" w:qFormat="1"/>
+    <w:lsdException w:name="Title" w:semiHidden="0" w:uiPriority="10" w:unhideWhenUsed="0" w:qFormat="1"/>
+    <w:lsdException w:name="Default Paragraph Font" w:uiPriority="1"/>
+    <w:lsdException w:name="Subtitle" w:semiHidden="0" w:uiPriority="11" w:unhideWhenUsed="0" w:qFormat="1"/>
+    <w:lsdException w:name="Strong" w:semiHidden="0" w:uiPriority="22" w:unhideWhenUsed="0" w:qFormat="1"/>
+    <w:lsdException w:name="Emphasis" w:semiHidden="0" w:uiPriority="20" w:unhideWhenUsed="0" w:qFormat="1"/>
+    <w:lsdException w:name="Table Grid" w:semiHidden="0" w:uiPriority="59" w:unhideWhenUsed="0"/>
+    <w:lsdException w:name="Placeholder Text" w:unhideWhenUsed="0"/>
+    <w:lsdException w:name="No Spacing" w:semiHidden="0" w:uiPriority="1" w:unhideWhenUsed="0" w:qFormat="1"/>
+    <w:lsdException w:name="Light Shading" w:semiHidden="0" w:uiPriority="60" w:unhideWhenUsed="0"/>
+    <w:lsdException w:name="Light List" w:semiHidden="0" w:uiPriority="61" w:unhideWhenUsed="0"/>
+    <w:lsdException w:name="Light Grid" w:semiHidden="0" w:uiPriority="62" w:unhideWhenUsed="0"/>
+    <w:lsdException w:name="Medium Shading 1" w:semiHidden="0" w:uiPriority="63" w:unhideWhenUsed="0"/>
+    <w:lsdException w:name="Medium Shading 2" w:semiHidden="0" w:uiPriority="64" w:unhideWhenUsed="0"/>
+    <w:lsdException w:name="Medium List 1" w:semiHidden="0" w:uiPriority="65" w:unhideWhenUsed="0"/>
+    <w:lsdException w:name="Medium List 2" w:semiHidden="0" w:uiPriority="66" w:unhideWhenUsed="0"/>
+    <w:lsdException w:name="Medium Grid 1" w:semiHidden="0" w:uiPriority="67" w:unhideWhenUsed="0"/>
+    <w:lsdException w:name="Medium Grid 2" w:semiHidden="0" w:uiPriority="68" w:unhideWhenUsed="0"/>
+    <w:lsdException w:name="Medium Grid 3" w:semiHidden="0" w:uiPriority="69" w:unhideWhenUsed="0"/>
+    <w:lsdException w:name="Dark List" w:semiHidden="0" w:uiPriority="70" w:unhideWhenUsed="0"/>
+    <w:lsdException w:name="Colorful Shading" w:semiHidden="0" w:uiPriority="71" w:unhideWhenUsed="0"/>
+    <w:lsdException w:name="Colorful List" w:semiHidden="0" w:uiPriority="72" w:unhideWhenUsed="0"/>
+    <w:lsdException w:name="Colorful Grid" w:semiHidden="0" w:uiPriority="73" w:unhideWhenUsed="0"/>
+    <w:lsdException w:name="Light Shading Accent 1" w:semiHidden="0" w:uiPriority="60" w:unhideWhenUsed="0"/>
+    <w:lsdException w:name="Light List Accent 1" w:semiHidden="0" w:uiPriority="61" w:unhideWhenUsed="0"/>
+    <w:lsdException w:name="Light Grid Accent 1" w:semiHidden="0" w:uiPriority="62" w:unhideWhenUsed="0"/>
+    <w:lsdException w:name="Medium Shading 1 Accent 1" w:semiHidden="0" w:uiPriority="63" w:unhideWhenUsed="0"/>
+    <w:lsdException w:name="Medium Shading 2 Accent 1" w:semiHidden="0" w:uiPriority="64" w:unhideWhenUsed="0"/>
+    <w:lsdException w:name="Medium List 1 Accent 1" w:semiHidden="0" w:uiPriority="65" w:unhideWhenUsed="0"/>
+    <w:lsdException w:name="Revision" w:unhideWhenUsed="0"/>
+    <w:lsdException w:name="List Paragraph" w:semiHidden="0" w:uiPriority="34" w:unhideWhenUsed="0" w:qFormat="1"/>
+    <w:lsdException w:name="Quote" w:semiHidden="0" w:uiPriority="29" w:unhideWhenUsed="0" w:qFormat="1"/>
+    <w:lsdException w:name="Intense Quote" w:semiHidden="0" w:uiPriority="30" w:unhideWhenUsed="0" w:qFormat="1"/>
+    <w:lsdException w:name="Medium List 2 Accent 1" w:semiHidden="0" w:uiPriority="66" w:unhideWhenUsed="0"/>
+    <w:lsdException w:name="Medium Grid 1 Accent 1" w:semiHidden="0" w:uiPriority="67" w:unhideWhenUsed="0"/>
+    <w:lsdException w:name="Medium Grid 2 Accent 1" w:semiHidden="0" w:uiPriority="68" w:unhideWhenUsed="0"/>
+    <w:lsdException w:name="Medium Grid 3 Accent 1" w:semiHidden="0" w:uiPriority="69" w:unhideWhenUsed="0"/>
+    <w:lsdException w:name="Dark List Accent 1" w:semiHidden="0" w:uiPriority="70" w:unhideWhenUsed="0"/>
+    <w:lsdException w:name="Colorful Shading Accent 1" w:semiHidden="0" w:uiPriority="71" w:unhideWhenUsed="0"/>
+    <w:lsdException w:name="Colorful List Accent 1" w:semiHidden="0" w:uiPriority="72" w:unhideWhenUsed="0"/>
+    <w:lsdException w:name="Colorful Grid Accent 1" w:semiHidden="0" w:uiPriority="73" w:unhideWhenUsed="0"/>
+    <w:lsdException w:name="Light Shading Accent 2" w:semiHidden="0" w:uiPriority="60" w:unhideWhenUsed="0"/>
+    <w:lsdException w:name="Light List Accent 2" w:semiHidden="0" w:uiPriority="61" w:unhideWhenUsed="0"/>
+    <w:lsdException w:name="Light Grid Accent 2" w:semiHidden="0" w:uiPriority="62" w:unhideWhenUsed="0"/>
+    <w:lsdException w:name="Medium Shading 1 Accent 2" w:semiHidden="0" w:uiPriority="63" w:unhideWhenUsed="0"/>
+    <w:lsdException w:name="Medium Shading 2 Accent 2" w:semiHidden="0" w:uiPriority="64" w:unhideWhenUsed="0"/>
+    <w:lsdException w:name="Medium List 1 Accent 2" w:semiHidden="0" w:uiPriority="65" w:unhideWhenUsed="0"/>
+    <w:lsdException w:name="Medium List 2 Accent 2" w:semiHidden="0" w:uiPriority="66" w:unhideWhenUsed="0"/>
+    <w:lsdException w:name="Medium Grid 1 Accent 2" w:semiHidden="0" w:uiPriority="67" w:unhideWhenUsed="0"/>
+    <w:lsdException w:name="Medium Grid 2 Accent 2" w:semiHidden="0" w:uiPriority="68" w:unhideWhenUsed="0"/>
+    <w:lsdException w:name="Medium Grid 3 Accent 2" w:semiHidden="0" w:uiPriority="69" w:unhideWhenUsed="0"/>
+    <w:lsdException w:name="Dark List Accent 2" w:semiHidden="0" w:uiPriority="70" w:unhideWhenUsed="0"/>
+    <w:lsdException w:name="Colorful Shading Accent 2" w:semiHidden="0" w:uiPriority="71" w:unhideWhenUsed="0"/>
+    <w:lsdException w:name="Colorful List Accent 2" w:semiHidden="0" w:uiPriority="72" w:unhideWhenUsed="0"/>
+    <w:lsdException w:name="Colorful Grid Accent 2" w:semiHidden="0" w:uiPriority="73" w:unhideWhenUsed="0"/>
+    <w:lsdException w:name="Light Shading Accent 3" w:semiHidden="0" w:uiPriority="60" w:unhideWhenUsed="0"/>
+    <w:lsdException w:name="Light List Accent 3" w:semiHidden="0" w:uiPriority="61" w:unhideWhenUsed="0"/>
+    <w:lsdException w:name="Light Grid Accent 3" w:semiHidden="0" w:uiPriority="62" w:unhideWhenUsed="0"/>
+    <w:lsdException w:name="Medium Shading 1 Accent 3" w:semiHidden="0" w:uiPriority="63" w:unhideWhenUsed="0"/>
+    <w:lsdException w:name="Medium Shading 2 Accent 3" w:semiHidden="0" w:uiPriority="64" w:unhideWhenUsed="0"/>
+    <w:lsdException w:name="Medium List 1 Accent 3" w:semiHidden="0" w:uiPriority="65" w:unhideWhenUsed="0"/>
+    <w:lsdException w:name="Medium List 2 Accent 3" w:semiHidden="0" w:uiPriority="66" w:unhideWhenUsed="0"/>
+    <w:lsdException w:name="Medium Grid 1 Accent 3" w:semiHidden="0" w:uiPriority="67" w:unhideWhenUsed="0"/>
+    <w:lsdException w:name="Medium Grid 2 Accent 3" w:semiHidden="0" w:uiPriority="68" w:unhideWhenUsed="0"/>
+    <w:lsdException w:name="Medium Grid 3 Accent 3" w:semiHidden="0" w:uiPriority="69" w:unhideWhenUsed="0"/>
+    <w:lsdException w:name="Dark List Accent 3" w:semiHidden="0" w:uiPriority="70" w:unhideWhenUsed="0"/>
+    <w:lsdException w:name="Colorful Shading Accent 3" w:semiHidden="0" w:uiPriority="71" w:unhideWhenUsed="0"/>
+    <w:lsdException w:name="Colorful List Accent 3" w:semiHidden="0" w:uiPriority="72" w:unhideWhenUsed="0"/>
+    <w:lsdException w:name="Colorful Grid Accent 3" w:semiHidden="0" w:uiPriority="73" w:unhideWhenUsed="0"/>
+    <w:lsdException w:name="Light Shading Accent 4" w:semiHidden="0" w:uiPriority="60" w:unhideWhenUsed="0"/>
+    <w:lsdException w:name="Light List Accent 4" w:semiHidden="0" w:uiPriority="61" w:unhideWhenUsed="0"/>
+    <w:lsdException w:name="Light Grid Accent 4" w:semiHidden="0" w:uiPriority="62" w:unhideWhenUsed="0"/>
+    <w:lsdException w:name="Medium Shading 1 Accent 4" w:semiHidden="0" w:uiPriority="63" w:unhideWhenUsed="0"/>
+    <w:lsdException w:name="Medium Shading 2 Accent 4" w:semiHidden="0" w:uiPriority="64" w:unhideWhenUsed="0"/>
+    <w:lsdException w:name="Medium List 1 Accent 4" w:semiHidden="0" w:uiPriority="65" w:unhideWhenUsed="0"/>
+    <w:lsdException w:name="Medium List 2 Accent 4" w:semiHidden="0" w:uiPriority="66" w:unhideWhenUsed="0"/>
+    <w:lsdException w:name="Medium Grid 1 Accent 4" w:semiHidden="0" w:uiPriority="67" w:unhideWhenUsed="0"/>
+    <w:lsdException w:name="Medium Grid 2 Accent 4" w:semiHidden="0" w:uiPriority="68" w:unhideWhenUsed="0"/>
+    <w:lsdException w:name="Medium Grid 3 Accent 4" w:semiHidden="0" w:uiPriority="69" w:unhideWhenUsed="0"/>
+    <w:lsdException w:name="Dark List Accent 4" w:semiHidden="0" w:uiPriority="70" w:unhideWhenUsed="0"/>
+    <w:lsdException w:name="Colorful Shading Accent 4" w:semiHidden="0" w:uiPriority="71" w:unhideWhenUsed="0"/>
+    <w:lsdException w:name="Colorful List Accent 4" w:semiHidden="0" w:uiPriority="72" w:unhideWhenUsed="0"/>
+    <w:lsdException w:name="Colorful Grid Accent 4" w:semiHidden="0" w:uiPriority="73" w:unhideWhenUsed="0"/>
+    <w:lsdException w:name="Light Shading Accent 5" w:semiHidden="0" w:uiPriority="60" w:unhideWhenUsed="0"/>
+    <w:lsdException w:name="Light List Accent 5" w:semiHidden="0" w:uiPriority="61" w:unhideWhenUsed="0"/>
+    <w:lsdException w:name="Light Grid Accent 5" w:semiHidden="0" w:uiPriority="62" w:unhideWhenUsed="0"/>
+    <w:lsdException w:name="Medium Shading 1 Accent 5" w:semiHidden="0" w:uiPriority="63" w:unhideWhenUsed="0"/>
+    <w:lsdException w:name="Medium Shading 2 Accent 5" w:semiHidden="0" w:uiPriority="64" w:unhideWhenUsed="0"/>
+    <w:lsdException w:name="Medium List 1 Accent 5" w:semiHidden="0" w:uiPriority="65" w:unhideWhenUsed="0"/>
+    <w:lsdException w:name="Medium List 2 Accent 5" w:semiHidden="0" w:uiPriority="66" w:unhideWhenUsed="0"/>
+    <w:lsdException w:name="Medium Grid 1 Accent 5" w:semiHidden="0" w:uiPriority="67" w:unhideWhenUsed="0"/>
+    <w:lsdException w:name="Medium Grid 2 Accent 5" w:semiHidden="0" w:uiPriority="68" w:unhideWhenUsed="0"/>
+    <w:lsdException w:name="Medium Grid 3 Accent 5" w:semiHidden="0" w:uiPriority="69" w:unhideWhenUsed="0"/>
+    <w:lsdException w:name="Dark List Accent 5" w:semiHidden="0" w:uiPriority="70" w:unhideWhenUsed="0"/>
+    <w:lsdException w:name="Colorful Shading Accent 5" w:semiHidden="0" w:uiPriority="71" w:unhideWhenUsed="0"/>
+    <w:lsdException w:name="Colorful List Accent 5" w:semiHidden="0" w:uiPriority="72" w:unhideWhenUsed="0"/>
+    <w:lsdException w:name="Colorful Grid Accent 5" w:semiHidden="0" w:uiPriority="73" w:unhideWhenUsed="0"/>
+    <w:lsdException w:name="Light Shading Accent 6" w:semiHidden="0" w:uiPriority="60" w:unhideWhenUsed="0"/>
+    <w:lsdException w:name="Light List Accent 6" w:semiHidden="0" w:uiPriority="61" w:unhideWhenUsed="0"/>
+    <w:lsdException w:name="Light Grid Accent 6" w:semiHidden="0" w:uiPriority="62" w:unhideWhenUsed="0"/>
+    <w:lsdException w:name="Medium Shading 1 Accent 6" w:semiHidden="0" w:uiPriority="63" w:unhideWhenUsed="0"/>
+    <w:lsdException w:name="Medium Shading 2 Accent 6" w:semiHidden="0" w:uiPriority="64" w:unhideWhenUsed="0"/>
+    <w:lsdException w:name="Medium List 1 Accent 6" w:semiHidden="0" w:uiPriority="65" w:unhideWhenUsed="0"/>
+    <w:lsdException w:name="Medium List 2 Accent 6" w:semiHidden="0" w:uiPriority="66" w:unhideWhenUsed="0"/>
+    <w:lsdException w:name="Medium Grid 1 Accent 6" w:semiHidden="0" w:uiPriority="67" w:unhideWhenUsed="0"/>
+    <w:lsdException w:name="Medium Grid 2 Accent 6" w:semiHidden="0" w:uiPriority="68" w:unhideWhenUsed="0"/>
+    <w:lsdException w:name="Medium Grid 3 Accent 6" w:semiHidden="0" w:uiPriority="69" w:unhideWhenUsed="0"/>
+    <w:lsdException w:name="Dark List Accent 6" w:semiHidden="0" w:uiPriority="70" w:unhideWhenUsed="0"/>
+    <w:lsdException w:name="Colorful Shading Accent 6" w:semiHidden="0" w:uiPriority="71" w:unhideWhenUsed="0"/>
+    <w:lsdException w:name="Colorful List Accent 6" w:semiHidden="0" w:uiPriority="72" w:unhideWhenUsed="0"/>
+    <w:lsdException w:name="Colorful Grid Accent 6" w:semiHidden="0" w:uiPriority="73" w:unhideWhenUsed="0"/>
+    <w:lsdException w:name="Subtle Emphasis" w:semiHidden="0" w:uiPriority="19" w:unhideWhenUsed="0" w:qFormat="1"/>
+    <w:lsdException w:name="Intense Emphasis" w:semiHidden="0" w:uiPriority="21" w:unhideWhenUsed="0" w:qFormat="1"/>
+    <w:lsdException w:name="Subtle Reference" w:semiHidden="0" w:uiPriority="31" w:unhideWhenUsed="0" w:qFormat="1"/>
+    <w:lsdException w:name="Intense Reference" w:semiHidden="0" w:uiPriority="32" w:unhideWhenUsed="0" w:qFormat="1"/>
+    <w:lsdException w:name="Book Title" w:semiHidden="0" w:uiPriority="33" w:unhideWhenUsed="0" w:qFormat="1"/>
+    <w:lsdException w:name="Bibliography" w:uiPriority="37"/>
+    <w:lsdException w:name="TOC Heading" w:uiPriority="39" w:qFormat="1"/>
+  </w:latentStyles>
+  <w:style w:type="paragraph" w:default="1" w:styleId="Normal">
+    <w:name w:val="Normal"/>
+    <w:qFormat/>
+  </w:style>
+  <w:style w:type="character" w:default="1" w:styleId="DefaultParagraphFont">
+    <w:name w:val="Default Paragraph Font"/>
+    <w:uiPriority w:val="1"/>
+    <w:semiHidden/>
+    <w:unhideWhenUsed/>
+  </w:style>
+  <w:style w:type="table" w:default="1" w:styleId="TableNormal">
+    <w:name w:val="Normal Table"/>
+    <w:uiPriority w:val="99"/>
+    <w:semiHidden/>
+    <w:unhideWhenUsed/>
+    <w:tblPr>
+      <w:tblInd w:w="0" w:type="dxa"/>
+      <w:tblCellMar>
+        <w:top w:w="0" w:type="dxa"/>
+        <w:left w:w="108" w:type="dxa"/>
+        <w:bottom w:w="0" w:type="dxa"/>
+        <w:right w:w="108" w:type="dxa"/>
+      </w:tblCellMar>
+    </w:tblPr>
+  </w:style>
+  <w:style w:type="numbering" w:default="1" w:styleId="NoList">
+    <w:name w:val="No List"/>
+    <w:uiPriority w:val="99"/>
+    <w:semiHidden/>
+    <w:unhideWhenUsed/>
+  </w:style>
+</w:styles>
 </file>
 
 <file path=word/theme/theme1.xml><?xml version="1.0" encoding="utf-8"?>

</xml_diff>

<commit_message>
P1 integrate: occurrence pipeline hoan thien (exempt self-collision, loop override bao toan ds_nganh canonical, fail-fast match_heading regex) + PLI_M72 5 bang + PLII_M02 4 loop semantic + regen artifacts trong allowlist + audit derive EXPECT_TOTAL_LOOPS tu form_maps
</commit_message>
<xml_diff>
--- a/app/templates/PLII_M02.docx
+++ b/app/templates/PLII_M02.docx
@@ -1643,96 +1643,227 @@
         <w:t xml:space="preserve">):</w:t>
       </w:r>
     </w:p>
-    <w:p>
-      <w:pPr>
-        <w:jc w:val="center"/>
-        <w:spacing w:before="120"/>
-      </w:pPr>
-      <w:r>
-        <w:rPr>
-          <w:rFonts w:ascii="Arial" w:hAnsi="Arial" w:cs="Arial"/>
-          <w:sz w:val="24"/>
-          <w:sz-cs w:val="24"/>
-        </w:rPr>
-        <w:t xml:space="preserve">STT</w:t>
-      </w:r>
-    </w:p>
-    <w:p>
-      <w:pPr>
-        <w:jc w:val="center"/>
-        <w:spacing w:before="120"/>
-      </w:pPr>
-      <w:r>
-        <w:rPr>
-          <w:rFonts w:ascii="Arial" w:hAnsi="Arial" w:cs="Arial"/>
-          <w:sz w:val="24"/>
-          <w:sz-cs w:val="24"/>
-        </w:rPr>
-        <w:t xml:space="preserve">Tên ngành, nghề kinh doanh được bổ sung</w:t>
-      </w:r>
-    </w:p>
-    <w:p>
-      <w:pPr>
-        <w:jc w:val="center"/>
-        <w:spacing w:before="120"/>
-      </w:pPr>
-      <w:r>
-        <w:rPr>
-          <w:rFonts w:ascii="Arial" w:hAnsi="Arial" w:cs="Arial"/>
-          <w:sz w:val="24"/>
-          <w:sz-cs w:val="24"/>
-        </w:rPr>
-        <w:t xml:space="preserve">Mã ngành</w:t>
-      </w:r>
-      <w:r>
-        <w:rPr>
-          <w:rFonts w:ascii="Arial" w:hAnsi="Arial" w:cs="Arial"/>
-          <w:sz w:val="24"/>
-          <w:sz-cs w:val="24"/>
-          <w:vertAlign w:val="superscript"/>
-        </w:rPr>
-        <w:t xml:space="preserve">4</w:t>
-      </w:r>
-      <w:r>
-        <w:rPr>
-          <w:rFonts w:ascii="Arial" w:hAnsi="Arial" w:cs="Arial"/>
-          <w:sz w:val="24"/>
-          <w:sz-cs w:val="24"/>
-        </w:rPr>
-        <w:t xml:space="preserve"/>
-      </w:r>
-    </w:p>
-    <w:p>
-      <w:pPr>
-        <w:jc w:val="center"/>
-        <w:spacing w:before="120"/>
-      </w:pPr>
-      <w:r>
-        <w:rPr>
-          <w:rFonts w:ascii="Arial" w:hAnsi="Arial" w:cs="Arial"/>
-          <w:sz w:val="24"/>
-          <w:sz-cs w:val="24"/>
-        </w:rPr>
-        <w:t xml:space="preserve">Ngành, nghề kinh doanh chính (</w:t>
-      </w:r>
-      <w:r>
-        <w:rPr>
-          <w:rFonts w:ascii="Arial" w:hAnsi="Arial" w:cs="Arial"/>
-          <w:sz w:val="24"/>
-          <w:sz-cs w:val="24"/>
-          <w:i/>
-        </w:rPr>
-        <w:t xml:space="preserve">Trường hợp một trong các ngành, nghề kinh doanh được bổ sung là ngành, nghề kinh doanh chính thì đánh dấu X vào ô này</w:t>
-      </w:r>
-      <w:r>
-        <w:rPr>
-          <w:rFonts w:ascii="Arial" w:hAnsi="Arial" w:cs="Arial"/>
-          <w:sz w:val="24"/>
-          <w:sz-cs w:val="24"/>
-        </w:rPr>
-        <w:t xml:space="preserve">)</w:t>
-      </w:r>
-    </w:p>
+    <w:tbl xmlns:ns0="urn:orca:p1a-temp">
+      <w:tblPr>
+        <w:tblW w:type="auto" w:w="0"/>
+        <w:tblLook w:firstColumn="1" w:firstRow="1" w:lastColumn="0" w:lastRow="0" w:noHBand="0" w:noVBand="1" w:val="04A0"/>
+        <w:tblBorders>
+          <w:top w:val="single" w:sz="4" w:color="000000"/>
+          <w:left w:val="single" w:sz="4" w:color="000000"/>
+          <w:bottom w:val="single" w:sz="4" w:color="000000"/>
+          <w:right w:val="single" w:sz="4" w:color="000000"/>
+          <w:insideH w:val="single" w:sz="4" w:color="000000"/>
+          <w:insideV w:val="single" w:sz="4" w:color="000000"/>
+        </w:tblBorders>
+      </w:tblPr>
+      <w:tblGrid>
+        <w:gridCol w:w="2160"/>
+        <w:gridCol w:w="2160"/>
+        <w:gridCol w:w="2160"/>
+        <w:gridCol w:w="2160"/>
+      </w:tblGrid>
+      <w:tr>
+        <w:tc>
+          <w:tcPr>
+            <w:tcW w:type="dxa" w:w="2160"/>
+          </w:tcPr>
+          <w:p>
+            <w:r>
+              <w:rPr>
+                <w:b/>
+              </w:rPr>
+              <w:t>STT</w:t>
+            </w:r>
+          </w:p>
+        </w:tc>
+        <w:tc>
+          <w:tcPr>
+            <w:tcW w:type="dxa" w:w="2160"/>
+          </w:tcPr>
+          <w:p>
+            <w:r>
+              <w:rPr>
+                <w:b/>
+              </w:rPr>
+              <w:t>Tên ngành, nghề kinh doanh được bổ sung</w:t>
+            </w:r>
+          </w:p>
+        </w:tc>
+        <w:tc>
+          <w:tcPr>
+            <w:tcW w:type="dxa" w:w="2160"/>
+          </w:tcPr>
+          <w:p>
+            <w:r>
+              <w:rPr>
+                <w:b/>
+              </w:rPr>
+              <w:t>Mã ngành</w:t>
+            </w:r>
+          </w:p>
+        </w:tc>
+        <w:tc>
+          <w:tcPr>
+            <w:tcW w:type="dxa" w:w="2160"/>
+          </w:tcPr>
+          <w:p>
+            <w:r>
+              <w:rPr>
+                <w:b/>
+              </w:rPr>
+              <w:t>Ngành, nghề kinh doanh chính</w:t>
+            </w:r>
+          </w:p>
+        </w:tc>
+      </w:tr>
+      <w:tr>
+        <w:tc>
+          <w:tcPr>
+            <w:tcW w:type="dxa" w:w="2160"/>
+          </w:tcPr>
+          <w:p/>
+        </w:tc>
+        <w:tc>
+          <w:tcPr>
+            <w:tcW w:type="dxa" w:w="2160"/>
+          </w:tcPr>
+          <w:p/>
+        </w:tc>
+        <w:tc>
+          <w:tcPr>
+            <w:tcW w:type="dxa" w:w="2160"/>
+          </w:tcPr>
+          <w:p/>
+        </w:tc>
+        <w:tc>
+          <w:tcPr>
+            <w:tcW w:type="dxa" w:w="2160"/>
+          </w:tcPr>
+          <w:p/>
+        </w:tc>
+      </w:tr>
+      <w:tr>
+        <w:tc>
+          <w:tcPr>
+            <w:tcW w:type="dxa" w:w="2160"/>
+          </w:tcPr>
+          <w:p/>
+        </w:tc>
+        <w:tc>
+          <w:tcPr>
+            <w:tcW w:type="dxa" w:w="2160"/>
+          </w:tcPr>
+          <w:p/>
+        </w:tc>
+        <w:tc>
+          <w:tcPr>
+            <w:tcW w:type="dxa" w:w="2160"/>
+          </w:tcPr>
+          <w:p/>
+        </w:tc>
+        <w:tc>
+          <w:tcPr>
+            <w:tcW w:type="dxa" w:w="2160"/>
+          </w:tcPr>
+          <w:p/>
+        </w:tc>
+      </w:tr>
+      <w:tr>
+        <w:tc>
+          <w:tcPr>
+            <w:tcW w:type="dxa" w:w="2160"/>
+          </w:tcPr>
+          <w:p/>
+        </w:tc>
+        <w:tc>
+          <w:tcPr>
+            <w:tcW w:type="dxa" w:w="2160"/>
+          </w:tcPr>
+          <w:p/>
+        </w:tc>
+        <w:tc>
+          <w:tcPr>
+            <w:tcW w:type="dxa" w:w="2160"/>
+          </w:tcPr>
+          <w:p/>
+        </w:tc>
+        <w:tc>
+          <w:tcPr>
+            <w:tcW w:type="dxa" w:w="2160"/>
+          </w:tcPr>
+          <w:p/>
+        </w:tc>
+      </w:tr>
+      <w:tr>
+        <w:tc>
+          <w:tcPr>
+            <w:tcW w:type="dxa" w:w="2160"/>
+          </w:tcPr>
+          <w:p/>
+        </w:tc>
+        <w:tc>
+          <w:tcPr>
+            <w:tcW w:type="dxa" w:w="2160"/>
+          </w:tcPr>
+          <w:p/>
+        </w:tc>
+        <w:tc>
+          <w:tcPr>
+            <w:tcW w:type="dxa" w:w="2160"/>
+          </w:tcPr>
+          <w:p/>
+        </w:tc>
+        <w:tc>
+          <w:tcPr>
+            <w:tcW w:type="dxa" w:w="2160"/>
+          </w:tcPr>
+          <w:p/>
+        </w:tc>
+      </w:tr>
+      <w:tr>
+        <w:tc>
+          <w:tcPr>
+            <w:tcW w:type="dxa" w:w="2160"/>
+          </w:tcPr>
+          <w:p>
+            <w:r>
+              <w:t>{#nganh_bo_sung}{_stt}</w:t>
+            </w:r>
+          </w:p>
+        </w:tc>
+        <w:tc>
+          <w:tcPr>
+            <w:tcW w:type="dxa" w:w="2160"/>
+          </w:tcPr>
+          <w:p>
+            <w:r>
+              <w:t>{ten_nganh_bo_sung}</w:t>
+            </w:r>
+          </w:p>
+        </w:tc>
+        <w:tc>
+          <w:tcPr>
+            <w:tcW w:type="dxa" w:w="2160"/>
+          </w:tcPr>
+          <w:p>
+            <w:r>
+              <w:t>{ma_nganh}</w:t>
+            </w:r>
+          </w:p>
+        </w:tc>
+        <w:tc>
+          <w:tcPr>
+            <w:tcW w:type="dxa" w:w="2160"/>
+          </w:tcPr>
+          <w:p>
+            <w:r>
+              <w:t>{la_nganh_chinh}{/nganh_bo_sung}</w:t>
+            </w:r>
+          </w:p>
+        </w:tc>
+      </w:tr>
+    </w:tbl>
+    <w:p/>
     <w:p>
       <w:pPr>
         <w:spacing w:before="120"/>
@@ -1852,88 +1983,227 @@
         <w:t xml:space="preserve">):</w:t>
       </w:r>
     </w:p>
-    <w:p>
-      <w:pPr>
-        <w:jc w:val="center"/>
-        <w:spacing w:before="120"/>
-      </w:pPr>
-      <w:r>
-        <w:rPr>
-          <w:rFonts w:ascii="Arial" w:hAnsi="Arial" w:cs="Arial"/>
-          <w:sz w:val="24"/>
-          <w:sz-cs w:val="24"/>
-        </w:rPr>
-        <w:t xml:space="preserve">STT</w:t>
-      </w:r>
-    </w:p>
-    <w:p>
-      <w:pPr>
-        <w:jc w:val="center"/>
-        <w:spacing w:before="120"/>
-      </w:pPr>
-      <w:r>
-        <w:rPr>
-          <w:rFonts w:ascii="Arial" w:hAnsi="Arial" w:cs="Arial"/>
-          <w:sz w:val="24"/>
-          <w:sz-cs w:val="24"/>
-        </w:rPr>
-        <w:t xml:space="preserve">Tên ngành, nghề kinh doanh được bỏ khỏi danh sách đã đăng ký</w:t>
-      </w:r>
-    </w:p>
-    <w:p>
-      <w:pPr>
-        <w:jc w:val="center"/>
-        <w:spacing w:before="120"/>
-      </w:pPr>
-      <w:r>
-        <w:rPr>
-          <w:rFonts w:ascii="Arial" w:hAnsi="Arial" w:cs="Arial"/>
-          <w:sz w:val="24"/>
-          <w:sz-cs w:val="24"/>
-        </w:rPr>
-        <w:t xml:space="preserve">Mã ngành</w:t>
-      </w:r>
-      <w:r>
-        <w:rPr>
-          <w:rFonts w:ascii="Arial" w:hAnsi="Arial" w:cs="Arial"/>
-          <w:sz w:val="24"/>
-          <w:sz-cs w:val="24"/>
-          <w:vertAlign w:val="superscript"/>
-        </w:rPr>
-        <w:t xml:space="preserve">5</w:t>
-      </w:r>
-    </w:p>
-    <w:p>
-      <w:pPr>
-        <w:jc w:val="center"/>
-        <w:spacing w:before="120"/>
-      </w:pPr>
-      <w:r>
-        <w:rPr>
-          <w:rFonts w:ascii="Arial" w:hAnsi="Arial" w:cs="Arial"/>
-          <w:sz w:val="24"/>
-          <w:sz-cs w:val="24"/>
-        </w:rPr>
-        <w:t xml:space="preserve">Ngành, nghề kinh doanh chính (</w:t>
-      </w:r>
-      <w:r>
-        <w:rPr>
-          <w:rFonts w:ascii="Arial" w:hAnsi="Arial" w:cs="Arial"/>
-          <w:sz w:val="24"/>
-          <w:sz-cs w:val="24"/>
-          <w:i/>
-        </w:rPr>
-        <w:t xml:space="preserve">Trường hợp ngành, nghề kinh doanh được bỏ là ngành, nghề kinh doanh chính thì đánh dấu X vào ô này</w:t>
-      </w:r>
-      <w:r>
-        <w:rPr>
-          <w:rFonts w:ascii="Arial" w:hAnsi="Arial" w:cs="Arial"/>
-          <w:sz w:val="24"/>
-          <w:sz-cs w:val="24"/>
-        </w:rPr>
-        <w:t xml:space="preserve">)</w:t>
-      </w:r>
-    </w:p>
+    <w:tbl xmlns:ns1="urn:orca:p1a-temp">
+      <w:tblPr>
+        <w:tblW w:type="auto" w:w="0"/>
+        <w:tblLook w:firstColumn="1" w:firstRow="1" w:lastColumn="0" w:lastRow="0" w:noHBand="0" w:noVBand="1" w:val="04A0"/>
+        <w:tblBorders>
+          <w:top w:val="single" w:sz="4" w:color="000000"/>
+          <w:left w:val="single" w:sz="4" w:color="000000"/>
+          <w:bottom w:val="single" w:sz="4" w:color="000000"/>
+          <w:right w:val="single" w:sz="4" w:color="000000"/>
+          <w:insideH w:val="single" w:sz="4" w:color="000000"/>
+          <w:insideV w:val="single" w:sz="4" w:color="000000"/>
+        </w:tblBorders>
+      </w:tblPr>
+      <w:tblGrid>
+        <w:gridCol w:w="2160"/>
+        <w:gridCol w:w="2160"/>
+        <w:gridCol w:w="2160"/>
+        <w:gridCol w:w="2160"/>
+      </w:tblGrid>
+      <w:tr>
+        <w:tc>
+          <w:tcPr>
+            <w:tcW w:type="dxa" w:w="2160"/>
+          </w:tcPr>
+          <w:p>
+            <w:r>
+              <w:rPr>
+                <w:b/>
+              </w:rPr>
+              <w:t>STT</w:t>
+            </w:r>
+          </w:p>
+        </w:tc>
+        <w:tc>
+          <w:tcPr>
+            <w:tcW w:type="dxa" w:w="2160"/>
+          </w:tcPr>
+          <w:p>
+            <w:r>
+              <w:rPr>
+                <w:b/>
+              </w:rPr>
+              <w:t>Tên ngành, nghề kinh doanh được bỏ khỏi danh sách đã đăng ký</w:t>
+            </w:r>
+          </w:p>
+        </w:tc>
+        <w:tc>
+          <w:tcPr>
+            <w:tcW w:type="dxa" w:w="2160"/>
+          </w:tcPr>
+          <w:p>
+            <w:r>
+              <w:rPr>
+                <w:b/>
+              </w:rPr>
+              <w:t>Mã ngành</w:t>
+            </w:r>
+          </w:p>
+        </w:tc>
+        <w:tc>
+          <w:tcPr>
+            <w:tcW w:type="dxa" w:w="2160"/>
+          </w:tcPr>
+          <w:p>
+            <w:r>
+              <w:rPr>
+                <w:b/>
+              </w:rPr>
+              <w:t>Ngành, nghề kinh doanh chính</w:t>
+            </w:r>
+          </w:p>
+        </w:tc>
+      </w:tr>
+      <w:tr>
+        <w:tc>
+          <w:tcPr>
+            <w:tcW w:type="dxa" w:w="2160"/>
+          </w:tcPr>
+          <w:p/>
+        </w:tc>
+        <w:tc>
+          <w:tcPr>
+            <w:tcW w:type="dxa" w:w="2160"/>
+          </w:tcPr>
+          <w:p/>
+        </w:tc>
+        <w:tc>
+          <w:tcPr>
+            <w:tcW w:type="dxa" w:w="2160"/>
+          </w:tcPr>
+          <w:p/>
+        </w:tc>
+        <w:tc>
+          <w:tcPr>
+            <w:tcW w:type="dxa" w:w="2160"/>
+          </w:tcPr>
+          <w:p/>
+        </w:tc>
+      </w:tr>
+      <w:tr>
+        <w:tc>
+          <w:tcPr>
+            <w:tcW w:type="dxa" w:w="2160"/>
+          </w:tcPr>
+          <w:p/>
+        </w:tc>
+        <w:tc>
+          <w:tcPr>
+            <w:tcW w:type="dxa" w:w="2160"/>
+          </w:tcPr>
+          <w:p/>
+        </w:tc>
+        <w:tc>
+          <w:tcPr>
+            <w:tcW w:type="dxa" w:w="2160"/>
+          </w:tcPr>
+          <w:p/>
+        </w:tc>
+        <w:tc>
+          <w:tcPr>
+            <w:tcW w:type="dxa" w:w="2160"/>
+          </w:tcPr>
+          <w:p/>
+        </w:tc>
+      </w:tr>
+      <w:tr>
+        <w:tc>
+          <w:tcPr>
+            <w:tcW w:type="dxa" w:w="2160"/>
+          </w:tcPr>
+          <w:p/>
+        </w:tc>
+        <w:tc>
+          <w:tcPr>
+            <w:tcW w:type="dxa" w:w="2160"/>
+          </w:tcPr>
+          <w:p/>
+        </w:tc>
+        <w:tc>
+          <w:tcPr>
+            <w:tcW w:type="dxa" w:w="2160"/>
+          </w:tcPr>
+          <w:p/>
+        </w:tc>
+        <w:tc>
+          <w:tcPr>
+            <w:tcW w:type="dxa" w:w="2160"/>
+          </w:tcPr>
+          <w:p/>
+        </w:tc>
+      </w:tr>
+      <w:tr>
+        <w:tc>
+          <w:tcPr>
+            <w:tcW w:type="dxa" w:w="2160"/>
+          </w:tcPr>
+          <w:p/>
+        </w:tc>
+        <w:tc>
+          <w:tcPr>
+            <w:tcW w:type="dxa" w:w="2160"/>
+          </w:tcPr>
+          <w:p/>
+        </w:tc>
+        <w:tc>
+          <w:tcPr>
+            <w:tcW w:type="dxa" w:w="2160"/>
+          </w:tcPr>
+          <w:p/>
+        </w:tc>
+        <w:tc>
+          <w:tcPr>
+            <w:tcW w:type="dxa" w:w="2160"/>
+          </w:tcPr>
+          <w:p/>
+        </w:tc>
+      </w:tr>
+      <w:tr>
+        <w:tc>
+          <w:tcPr>
+            <w:tcW w:type="dxa" w:w="2160"/>
+          </w:tcPr>
+          <w:p>
+            <w:r>
+              <w:t>{#nganh_xoa_bo}{_stt}</w:t>
+            </w:r>
+          </w:p>
+        </w:tc>
+        <w:tc>
+          <w:tcPr>
+            <w:tcW w:type="dxa" w:w="2160"/>
+          </w:tcPr>
+          <w:p>
+            <w:r>
+              <w:t>{ten_nganh_bo}</w:t>
+            </w:r>
+          </w:p>
+        </w:tc>
+        <w:tc>
+          <w:tcPr>
+            <w:tcW w:type="dxa" w:w="2160"/>
+          </w:tcPr>
+          <w:p>
+            <w:r>
+              <w:t>{ma_nganh}</w:t>
+            </w:r>
+          </w:p>
+        </w:tc>
+        <w:tc>
+          <w:tcPr>
+            <w:tcW w:type="dxa" w:w="2160"/>
+          </w:tcPr>
+          <w:p>
+            <w:r>
+              <w:t>{la_nganh_chinh}{/nganh_xoa_bo}</w:t>
+            </w:r>
+          </w:p>
+        </w:tc>
+      </w:tr>
+    </w:tbl>
+    <w:p/>
     <w:p>
       <w:pPr>
         <w:spacing w:before="120"/>
@@ -2045,57 +2315,179 @@
         <w:t xml:space="preserve">):</w:t>
       </w:r>
     </w:p>
-    <w:p>
-      <w:pPr>
-        <w:jc w:val="center"/>
-        <w:spacing w:before="120"/>
-      </w:pPr>
-      <w:r>
-        <w:rPr>
-          <w:rFonts w:ascii="Arial" w:hAnsi="Arial" w:cs="Arial"/>
-          <w:sz w:val="24"/>
-          <w:sz-cs w:val="24"/>
-        </w:rPr>
-        <w:t xml:space="preserve">STT</w:t>
-      </w:r>
-    </w:p>
-    <w:p>
-      <w:pPr>
-        <w:jc w:val="center"/>
-        <w:spacing w:before="120"/>
-      </w:pPr>
-      <w:r>
-        <w:rPr>
-          <w:rFonts w:ascii="Arial" w:hAnsi="Arial" w:cs="Arial"/>
-          <w:sz w:val="24"/>
-          <w:sz-cs w:val="24"/>
-        </w:rPr>
-        <w:t xml:space="preserve">Tên ngành, nghề kinh doanh</w:t>
-      </w:r>
-    </w:p>
-    <w:p>
-      <w:pPr>
-        <w:jc w:val="center"/>
-        <w:spacing w:before="120"/>
-      </w:pPr>
-      <w:r>
-        <w:rPr>
-          <w:rFonts w:ascii="Arial" w:hAnsi="Arial" w:cs="Arial"/>
-          <w:sz w:val="24"/>
-          <w:sz-cs w:val="24"/>
-        </w:rPr>
-        <w:t xml:space="preserve">Mã ngành</w:t>
-      </w:r>
-      <w:r>
-        <w:rPr>
-          <w:rFonts w:ascii="Arial" w:hAnsi="Arial" w:cs="Arial"/>
-          <w:sz w:val="24"/>
-          <w:sz-cs w:val="24"/>
-          <w:vertAlign w:val="superscript"/>
-        </w:rPr>
-        <w:t xml:space="preserve"/>
-      </w:r>
-    </w:p>
+    <w:tbl xmlns:ns2="urn:orca:p1a-temp">
+      <w:tblPr>
+        <w:tblW w:type="auto" w:w="0"/>
+        <w:tblLook w:firstColumn="1" w:firstRow="1" w:lastColumn="0" w:lastRow="0" w:noHBand="0" w:noVBand="1" w:val="04A0"/>
+        <w:tblBorders>
+          <w:top w:val="single" w:sz="4" w:color="000000"/>
+          <w:left w:val="single" w:sz="4" w:color="000000"/>
+          <w:bottom w:val="single" w:sz="4" w:color="000000"/>
+          <w:right w:val="single" w:sz="4" w:color="000000"/>
+          <w:insideH w:val="single" w:sz="4" w:color="000000"/>
+          <w:insideV w:val="single" w:sz="4" w:color="000000"/>
+        </w:tblBorders>
+      </w:tblPr>
+      <w:tblGrid>
+        <w:gridCol w:w="2880"/>
+        <w:gridCol w:w="2880"/>
+        <w:gridCol w:w="2880"/>
+      </w:tblGrid>
+      <w:tr>
+        <w:tc>
+          <w:tcPr>
+            <w:tcW w:type="dxa" w:w="2880"/>
+          </w:tcPr>
+          <w:p>
+            <w:r>
+              <w:rPr>
+                <w:b/>
+              </w:rPr>
+              <w:t>STT</w:t>
+            </w:r>
+          </w:p>
+        </w:tc>
+        <w:tc>
+          <w:tcPr>
+            <w:tcW w:type="dxa" w:w="2880"/>
+          </w:tcPr>
+          <w:p>
+            <w:r>
+              <w:rPr>
+                <w:b/>
+              </w:rPr>
+              <w:t>Tên ngành, nghề kinh doanh</w:t>
+            </w:r>
+          </w:p>
+        </w:tc>
+        <w:tc>
+          <w:tcPr>
+            <w:tcW w:type="dxa" w:w="2880"/>
+          </w:tcPr>
+          <w:p>
+            <w:r>
+              <w:rPr>
+                <w:b/>
+              </w:rPr>
+              <w:t>Mã ngành</w:t>
+            </w:r>
+          </w:p>
+        </w:tc>
+      </w:tr>
+      <w:tr>
+        <w:tc>
+          <w:tcPr>
+            <w:tcW w:type="dxa" w:w="2880"/>
+          </w:tcPr>
+          <w:p/>
+        </w:tc>
+        <w:tc>
+          <w:tcPr>
+            <w:tcW w:type="dxa" w:w="2880"/>
+          </w:tcPr>
+          <w:p/>
+        </w:tc>
+        <w:tc>
+          <w:tcPr>
+            <w:tcW w:type="dxa" w:w="2880"/>
+          </w:tcPr>
+          <w:p/>
+        </w:tc>
+      </w:tr>
+      <w:tr>
+        <w:tc>
+          <w:tcPr>
+            <w:tcW w:type="dxa" w:w="2880"/>
+          </w:tcPr>
+          <w:p/>
+        </w:tc>
+        <w:tc>
+          <w:tcPr>
+            <w:tcW w:type="dxa" w:w="2880"/>
+          </w:tcPr>
+          <w:p/>
+        </w:tc>
+        <w:tc>
+          <w:tcPr>
+            <w:tcW w:type="dxa" w:w="2880"/>
+          </w:tcPr>
+          <w:p/>
+        </w:tc>
+      </w:tr>
+      <w:tr>
+        <w:tc>
+          <w:tcPr>
+            <w:tcW w:type="dxa" w:w="2880"/>
+          </w:tcPr>
+          <w:p/>
+        </w:tc>
+        <w:tc>
+          <w:tcPr>
+            <w:tcW w:type="dxa" w:w="2880"/>
+          </w:tcPr>
+          <w:p/>
+        </w:tc>
+        <w:tc>
+          <w:tcPr>
+            <w:tcW w:type="dxa" w:w="2880"/>
+          </w:tcPr>
+          <w:p/>
+        </w:tc>
+      </w:tr>
+      <w:tr>
+        <w:tc>
+          <w:tcPr>
+            <w:tcW w:type="dxa" w:w="2880"/>
+          </w:tcPr>
+          <w:p/>
+        </w:tc>
+        <w:tc>
+          <w:tcPr>
+            <w:tcW w:type="dxa" w:w="2880"/>
+          </w:tcPr>
+          <w:p/>
+        </w:tc>
+        <w:tc>
+          <w:tcPr>
+            <w:tcW w:type="dxa" w:w="2880"/>
+          </w:tcPr>
+          <w:p/>
+        </w:tc>
+      </w:tr>
+      <w:tr>
+        <w:tc>
+          <w:tcPr>
+            <w:tcW w:type="dxa" w:w="2880"/>
+          </w:tcPr>
+          <w:p>
+            <w:r>
+              <w:t>{#nganh_sua_doi_chi_tiet}{_stt}</w:t>
+            </w:r>
+          </w:p>
+        </w:tc>
+        <w:tc>
+          <w:tcPr>
+            <w:tcW w:type="dxa" w:w="2880"/>
+          </w:tcPr>
+          <w:p>
+            <w:r>
+              <w:t>{ten_nganh}</w:t>
+            </w:r>
+          </w:p>
+        </w:tc>
+        <w:tc>
+          <w:tcPr>
+            <w:tcW w:type="dxa" w:w="2880"/>
+          </w:tcPr>
+          <w:p>
+            <w:r>
+              <w:t>{ma_nganh}{/nganh_sua_doi_chi_tiet}</w:t>
+            </w:r>
+          </w:p>
+        </w:tc>
+      </w:tr>
+    </w:tbl>
+    <w:p/>
     <w:p>
       <w:pPr>
         <w:spacing w:before="120"/>
@@ -2706,7 +3098,7 @@
         <w:t xml:space="preserve"> </w:t>
       </w:r>
     </w:p>
-    <w:tbl>
+    <w:tbl xmlns:ns3="urn:orca:p1a-temp">
       <w:tblPr>
         <w:tblW w:type="auto" w:w="0"/>
         <w:tblLook w:firstColumn="1" w:firstRow="1" w:lastColumn="0" w:lastRow="0" w:noHBand="0" w:noVBand="1" w:val="04A0"/>

</xml_diff>

<commit_message>
f1in(regen): 6 template + blocks + form_maps theo spec O1 — M12 3 w:tbl (8 bảng), M27 3 loop, M78 1 matrix, M79/M80 1 loop, PLII_M02 C5 matrix; key trùng C5/trụ sở được tách scoped
</commit_message>
<xml_diff>
--- a/app/templates/PLII_M02.docx
+++ b/app/templates/PLII_M02.docx
@@ -12,7 +12,7 @@
         <w:t>Mẫu số 2</w:t>
       </w:r>
     </w:p>
-    <w:tbl xmlns:ns9="urn:orca:hdr2col">
+    <w:tbl xmlns:ns10="urn:orca:hdr2col">
       <w:tblPr>
         <w:tblW w:type="dxa" w:w="8640"/>
         <w:tblBorders>
@@ -4198,207 +4198,148 @@
         <w:t xml:space="preserve">:</w:t>
       </w:r>
     </w:p>
-    <w:p>
-      <w:pPr>
-        <w:jc w:val="center"/>
-        <w:spacing w:before="120"/>
-      </w:pPr>
-      <w:r>
-        <w:rPr>
-          <w:rFonts w:ascii="Arial" w:hAnsi="Arial" w:cs="Arial"/>
-          <w:sz w:val="24"/>
-          <w:sz-cs w:val="24"/>
-        </w:rPr>
-        <w:t xml:space="preserve">Các chỉ tiêu thông tin đăng ký thuế</w:t>
-      </w:r>
-    </w:p>
-    <w:p>
-      <w:pPr>
-        <w:jc w:val="center"/>
-        <w:spacing w:before="120"/>
-      </w:pPr>
-      <w:r>
-        <w:rPr>
-          <w:rFonts w:ascii="Arial" w:hAnsi="Arial" w:cs="Arial"/>
-          <w:sz w:val="24"/>
-          <w:sz-cs w:val="24"/>
-        </w:rPr>
-        <w:t xml:space="preserve">5.1</w:t>
-      </w:r>
-    </w:p>
-    <w:p>
-      <w:pPr>
-        <w:spacing w:before="120"/>
-      </w:pPr>
-      <w:r>
-        <w:rPr>
-          <w:rFonts w:ascii="Arial" w:hAnsi="Arial" w:cs="Arial"/>
-          <w:sz w:val="24"/>
-          <w:sz-cs w:val="24"/>
-        </w:rPr>
-        <w:t xml:space="preserve">Địa chỉ nhận thông báo thuế </w:t>
-      </w:r>
-      <w:r>
-        <w:rPr>
-          <w:rFonts w:ascii="Arial" w:hAnsi="Arial" w:cs="Arial"/>
-          <w:sz w:val="24"/>
-          <w:sz-cs w:val="24"/>
-          <w:i/>
-        </w:rPr>
-        <w:t xml:space="preserve">(chỉ kê khai nếu địa chỉ nhận thông báo thuế khác địa chỉ trụ sở)</w:t>
-      </w:r>
-      <w:r>
-        <w:rPr>
-          <w:rFonts w:ascii="Arial" w:hAnsi="Arial" w:cs="Arial"/>
-          <w:sz w:val="24"/>
-          <w:sz-cs w:val="24"/>
-        </w:rPr>
-        <w:t xml:space="preserve">:</w:t>
-      </w:r>
-    </w:p>
-    <w:p>
-      <w:pPr>
-        <w:spacing w:before="120"/>
-      </w:pPr>
-      <w:r>
-        <w:rPr>
-          <w:rFonts w:ascii="Arial" w:hAnsi="Arial" w:cs="Arial"/>
-          <w:sz w:val="24"/>
-          <w:sz-cs w:val="24"/>
-        </w:rPr>
-        <w:t>Số nhà/phòng, ngách/hẻm, ngõ/kiệt, đường/phố/đại lộ, tổ/xóm/ấp/thôn: {dia_chi_chi_tiet}</w:t>
-      </w:r>
-    </w:p>
-    <w:p>
-      <w:pPr>
-        <w:spacing w:before="120"/>
-      </w:pPr>
-      <w:r>
-        <w:rPr>
-          <w:rFonts w:ascii="Arial" w:hAnsi="Arial" w:cs="Arial"/>
-          <w:sz w:val="24"/>
-          <w:sz-cs w:val="24"/>
-        </w:rPr>
-        <w:t>Xã/Phường/Đặc khu: {xa_phuong}</w:t>
-      </w:r>
-    </w:p>
-    <w:p>
-      <w:pPr>
-        <w:spacing w:before="120"/>
-      </w:pPr>
-      <w:r>
-        <w:rPr>
-          <w:rFonts w:ascii="Arial" w:hAnsi="Arial" w:cs="Arial"/>
-          <w:sz w:val="24"/>
-          <w:sz-cs w:val="24"/>
-        </w:rPr>
-        <w:t>Tỉnh/Thành phố trực thuộc trung ương: {tinh_thanh}</w:t>
-      </w:r>
-    </w:p>
-    <w:p>
-      <w:pPr>
-        <w:spacing w:before="120"/>
-      </w:pPr>
-      <w:r>
-        <w:rPr>
-          <w:rFonts w:ascii="Arial" w:hAnsi="Arial" w:cs="Arial"/>
-          <w:sz w:val="24"/>
-          <w:sz-cs w:val="24"/>
-        </w:rPr>
-        <w:t>Điện thoại</w:t>
-      </w:r>
-      <w:r>
-        <w:rPr>
-          <w:rFonts w:ascii="Arial" w:hAnsi="Arial" w:cs="Arial"/>
-          <w:sz w:val="24"/>
-          <w:sz-cs w:val="24"/>
-          <w:i/>
-        </w:rPr>
-        <w:t xml:space="preserve"> (nếu có)</w:t>
-      </w:r>
-      <w:r>
-        <w:rPr>
-          <w:rFonts w:ascii="Arial" w:hAnsi="Arial" w:cs="Arial"/>
-          <w:sz w:val="24"/>
-          <w:sz-cs w:val="24"/>
-        </w:rPr>
-        <w:t xml:space="preserve">: {dien_thoai_lien_he} Fax </w:t>
-      </w:r>
-      <w:r>
-        <w:rPr>
-          <w:rFonts w:ascii="Arial" w:hAnsi="Arial" w:cs="Arial"/>
-          <w:sz w:val="24"/>
-          <w:sz-cs w:val="24"/>
-          <w:i/>
-        </w:rPr>
-        <w:t>(nếu có)</w:t>
-      </w:r>
-      <w:r>
-        <w:rPr>
-          <w:rFonts w:ascii="Arial" w:hAnsi="Arial" w:cs="Arial"/>
-          <w:sz w:val="24"/>
-          <w:sz-cs w:val="24"/>
-        </w:rPr>
-        <w:t>: {fax}</w:t>
-      </w:r>
-    </w:p>
-    <w:p>
-      <w:pPr>
-        <w:spacing w:before="120"/>
-      </w:pPr>
-      <w:r>
-        <w:rPr>
-          <w:rFonts w:ascii="Arial" w:hAnsi="Arial" w:cs="Arial"/>
-          <w:sz w:val="24"/>
-          <w:sz-cs w:val="24"/>
-        </w:rPr>
-        <w:t xml:space="preserve">Thư điện tử </w:t>
-      </w:r>
-      <w:r>
-        <w:rPr>
-          <w:rFonts w:ascii="Arial" w:hAnsi="Arial" w:cs="Arial"/>
-          <w:sz w:val="24"/>
-          <w:sz-cs w:val="24"/>
-          <w:i/>
-        </w:rPr>
-        <w:t>(nếu có)</w:t>
-      </w:r>
-      <w:r>
-        <w:rPr>
-          <w:rFonts w:ascii="Arial" w:hAnsi="Arial" w:cs="Arial"/>
-          <w:sz w:val="24"/>
-          <w:sz-cs w:val="24"/>
-        </w:rPr>
-        <w:t>: {email_tru_so}</w:t>
-      </w:r>
-    </w:p>
-    <w:p>
-      <w:pPr>
-        <w:jc w:val="center"/>
-        <w:spacing w:before="120"/>
-      </w:pPr>
-      <w:r>
-        <w:rPr>
-          <w:rFonts w:ascii="Arial" w:hAnsi="Arial" w:cs="Arial"/>
-          <w:sz w:val="24"/>
-          <w:sz-cs w:val="24"/>
-        </w:rPr>
-        <w:t xml:space="preserve">5.2</w:t>
-      </w:r>
-    </w:p>
-    <w:p>
-      <w:pPr>
-        <w:spacing w:before="120"/>
-      </w:pPr>
-      <w:r>
-        <w:rPr>
-          <w:rFonts w:ascii="Arial" w:hAnsi="Arial" w:cs="Arial"/>
-          <w:sz w:val="24"/>
-          <w:sz-cs w:val="24"/>
-        </w:rPr>
-        <w:t>Tổng số lao động: {so_lao_dong}</w:t>
-      </w:r>
-    </w:p>
+    <w:tbl xmlns:ns9="urn:orca:p1b-temp">
+      <w:tblPr>
+        <w:tblW w:type="auto" w:w="0"/>
+        <w:tblLook w:firstColumn="1" w:firstRow="1" w:lastColumn="0" w:lastRow="0" w:noHBand="0" w:noVBand="1" w:val="04A0"/>
+        <w:tblBorders>
+          <w:top w:val="single" w:sz="4" w:color="000000"/>
+          <w:left w:val="single" w:sz="4" w:color="000000"/>
+          <w:bottom w:val="single" w:sz="4" w:color="000000"/>
+          <w:right w:val="single" w:sz="4" w:color="000000"/>
+          <w:insideH w:val="single" w:sz="4" w:color="000000"/>
+          <w:insideV w:val="single" w:sz="4" w:color="000000"/>
+        </w:tblBorders>
+      </w:tblPr>
+      <w:tblGrid>
+        <w:gridCol w:w="2880"/>
+        <w:gridCol w:w="2880"/>
+        <w:gridCol w:w="2880"/>
+      </w:tblGrid>
+      <w:tr>
+        <w:tc>
+          <w:tcPr>
+            <w:tcW w:type="dxa" w:w="2880"/>
+          </w:tcPr>
+          <w:p>
+            <w:r>
+              <w:rPr>
+                <w:b/>
+              </w:rPr>
+              <w:t>STT / Các chỉ tiêu thông tin đăng ký thuế</w:t>
+            </w:r>
+          </w:p>
+        </w:tc>
+        <w:tc>
+          <w:tcPr>
+            <w:tcW w:type="dxa" w:w="2880"/>
+          </w:tcPr>
+          <w:p>
+            <w:r>
+              <w:rPr>
+                <w:b/>
+              </w:rPr>
+              <w:t>Địa chỉ nhận thông báo thuế (số nhà/phòng, ngách/hẻm, ngõ/kiệt, đường/phố/đại lộ, tổ/xóm/ấp/thôn; xã/phường/đặc khu; tỉnh/thành phố trực thuộc trung ương; điện thoại; thư điện tử — chỉ kê khai nếu khác địa chỉ trụ sở)</w:t>
+            </w:r>
+          </w:p>
+        </w:tc>
+        <w:tc>
+          <w:tcPr>
+            <w:tcW w:type="dxa" w:w="2880"/>
+          </w:tcPr>
+          <w:p>
+            <w:r>
+              <w:rPr>
+                <w:b/>
+              </w:rPr>
+              <w:t>Tổng số lao động</w:t>
+            </w:r>
+          </w:p>
+        </w:tc>
+      </w:tr>
+      <w:tr>
+        <w:tc>
+          <w:tcPr>
+            <w:tcW w:type="dxa" w:w="2880"/>
+          </w:tcPr>
+          <w:p>
+            <w:r>
+              <w:rPr>
+                <w:b w:val="0"/>
+              </w:rPr>
+              <w:t>5.1 Địa chỉ nhận thông báo thuế (chỉ kê khai nếu địa chỉ nhận thông báo thuế khác địa chỉ trụ sở):</w:t>
+            </w:r>
+          </w:p>
+        </w:tc>
+        <w:tc>
+          <w:tcPr>
+            <w:tcW w:type="dxa" w:w="2880"/>
+          </w:tcPr>
+          <w:p>
+            <w:r>
+              <w:rPr>
+                <w:b w:val="0"/>
+              </w:rPr>
+              <w:t>{thue_chi_tieu_cap_doi.chi_tieu_5_1_dia_chi_nhan_thong_bao_thue.dia_chi_nhan_thong_bao_thue}</w:t>
+            </w:r>
+          </w:p>
+        </w:tc>
+        <w:tc>
+          <w:tcPr>
+            <w:tcW w:type="dxa" w:w="2880"/>
+          </w:tcPr>
+          <w:p>
+            <w:r>
+              <w:rPr>
+                <w:b w:val="0"/>
+              </w:rPr>
+              <w:t>{thue_chi_tieu_cap_doi.chi_tieu_5_1_dia_chi_nhan_thong_bao_thue.so_lao_dong}</w:t>
+            </w:r>
+          </w:p>
+        </w:tc>
+      </w:tr>
+      <w:tr>
+        <w:tc>
+          <w:tcPr>
+            <w:tcW w:type="dxa" w:w="2880"/>
+          </w:tcPr>
+          <w:p>
+            <w:r>
+              <w:rPr>
+                <w:b w:val="0"/>
+              </w:rPr>
+              <w:t>5.2 Tổng số lao động</w:t>
+            </w:r>
+          </w:p>
+        </w:tc>
+        <w:tc>
+          <w:tcPr>
+            <w:tcW w:type="dxa" w:w="2880"/>
+          </w:tcPr>
+          <w:p>
+            <w:r>
+              <w:rPr>
+                <w:b w:val="0"/>
+              </w:rPr>
+              <w:t>{thue_chi_tieu_cap_doi.chi_tieu_5_2_tong_so_lao_dong.dia_chi_nhan_thong_bao_thue}</w:t>
+            </w:r>
+          </w:p>
+        </w:tc>
+        <w:tc>
+          <w:tcPr>
+            <w:tcW w:type="dxa" w:w="2880"/>
+          </w:tcPr>
+          <w:p>
+            <w:r>
+              <w:rPr>
+                <w:b w:val="0"/>
+              </w:rPr>
+              <w:t>{thue_chi_tieu_cap_doi.chi_tieu_5_2_tong_so_lao_dong.so_lao_dong}</w:t>
+            </w:r>
+          </w:p>
+        </w:tc>
+      </w:tr>
+    </w:tbl>
     <w:p>
       <w:pPr>
         <w:spacing w:before="0" w:after="0" w:line="20" w:lineRule="exact"/>
@@ -4413,6 +4354,7 @@
         </w:sectPr>
       </w:pPr>
     </w:p>
+    <w:p/>
     <w:p>
       <w:pPr>
         <w:spacing w:before="120"/>

</xml_diff>

<commit_message>
fix(owner-2026-09-08): band = CHỈ tên DN, không nhãn — _bind_header_name_slot xoá toàn bộ run (nhãn TÊN DOANH NGHIỆP + dòng kẻ) thay bằng 1 run token; 23/23 form band verified; regen ×2
</commit_message>
<xml_diff>
--- a/app/templates/PLII_M02.docx
+++ b/app/templates/PLII_M02.docx
@@ -54,14 +54,10 @@
             </w:pPr>
             <w:r>
               <w:rPr>
-                <w:rFonts w:ascii="Arial" w:hAnsi="Arial" w:cs="Arial"/>
-                <w:sz w:val="24"/>
-                <w:sz-cs w:val="24"/>
+                <w:rFonts w:ascii="Arial" w:hAnsi="Arial"/>
                 <w:b/>
               </w:rPr>
-              <w:t xml:space="preserve">TÊN HỘ KINH DOANH</w:t>
-              <w:br/>
-              <w:t xml:space="preserve">{hkd_ten_tieng_viet_2}</w:t>
+              <w:t>{hkd_ten_tieng_viet_2}</w:t>
             </w:r>
           </w:p>
         </w:tc>

</xml_diff>